<commit_message>
fix: make GDD docx headings black to match the template
docx-js ignored the custom heading-style colours and emitted its built-in
blue Heading styles (2E74B5/1F4D78) plus a blue Hyperlink style for the TOC,
so every heading rendered blue instead of the template's black ink. Patch the
generated styles.xml to recolour all heading/link styles to black.

Co-Authored-By: Claude Opus 4.8 <noreply@anthropic.com>
</commit_message>
<xml_diff>
--- a/GDD_Tahan_Pedas_iGDD.docx
+++ b/GDD_Tahan_Pedas_iGDD.docx
@@ -11,7 +11,7 @@
         <w:rPr>
           <w:b/>
           <w:bCs/>
-          <w:color w:val="2E74B5"/>
+          <w:color w:val="1A1A1A"/>
           <w:sz w:val="56"/>
           <w:szCs w:val="56"/>
         </w:rPr>
@@ -51,7 +51,7 @@
         <w:rPr>
           <w:b/>
           <w:bCs/>
-          <w:color w:val="2E74B5"/>
+          <w:color w:val="1A1A1A"/>
           <w:sz w:val="28"/>
           <w:szCs w:val="28"/>
         </w:rPr>
@@ -65,7 +65,7 @@
       </w:pPr>
       <w:r>
         <w:rPr>
-          <w:color w:val="2E74B5"/>
+          <w:color w:val="1A1A1A"/>
           <w:sz w:val="24"/>
           <w:szCs w:val="24"/>
         </w:rPr>
@@ -79,7 +79,7 @@
       </w:pPr>
       <w:r>
         <w:rPr>
-          <w:color w:val="2E74B5"/>
+          <w:color w:val="1A1A1A"/>
           <w:sz w:val="22"/>
           <w:szCs w:val="22"/>
         </w:rPr>
@@ -95,7 +95,7 @@
         <w:rPr>
           <w:b/>
           <w:bCs/>
-          <w:color w:val="2E74B5"/>
+          <w:color w:val="1A1A1A"/>
           <w:sz w:val="26"/>
           <w:szCs w:val="26"/>
         </w:rPr>
@@ -109,7 +109,7 @@
       </w:pPr>
       <w:r>
         <w:rPr>
-          <w:color w:val="2E74B5"/>
+          <w:color w:val="1A1A1A"/>
           <w:sz w:val="24"/>
           <w:szCs w:val="24"/>
         </w:rPr>
@@ -664,7 +664,7 @@
               <w:bottom w:val="single" w:color="BBBBBB" w:sz="1"/>
               <w:right w:val="single" w:color="BBBBBB" w:sz="1"/>
             </w:tcBorders>
-            <w:shd w:fill="D9E2F3" w:val="clear"/>
+            <w:shd w:fill="EDEDED" w:val="clear"/>
             <w:tcMar>
               <w:top w:type="dxa" w:w="60"/>
               <w:left w:type="dxa" w:w="110"/>
@@ -694,7 +694,7 @@
               <w:bottom w:val="single" w:color="BBBBBB" w:sz="1"/>
               <w:right w:val="single" w:color="BBBBBB" w:sz="1"/>
             </w:tcBorders>
-            <w:shd w:fill="D9E2F3" w:val="clear"/>
+            <w:shd w:fill="EDEDED" w:val="clear"/>
             <w:tcMar>
               <w:top w:type="dxa" w:w="60"/>
               <w:left w:type="dxa" w:w="110"/>
@@ -724,7 +724,7 @@
               <w:bottom w:val="single" w:color="BBBBBB" w:sz="1"/>
               <w:right w:val="single" w:color="BBBBBB" w:sz="1"/>
             </w:tcBorders>
-            <w:shd w:fill="D9E2F3" w:val="clear"/>
+            <w:shd w:fill="EDEDED" w:val="clear"/>
             <w:tcMar>
               <w:top w:type="dxa" w:w="60"/>
               <w:left w:type="dxa" w:w="110"/>
@@ -1069,7 +1069,7 @@
               <w:bottom w:val="single" w:color="BBBBBB" w:sz="1"/>
               <w:right w:val="single" w:color="BBBBBB" w:sz="1"/>
             </w:tcBorders>
-            <w:shd w:fill="D9E2F3" w:val="clear"/>
+            <w:shd w:fill="EDEDED" w:val="clear"/>
             <w:tcMar>
               <w:top w:type="dxa" w:w="60"/>
               <w:left w:type="dxa" w:w="110"/>
@@ -1099,7 +1099,7 @@
               <w:bottom w:val="single" w:color="BBBBBB" w:sz="1"/>
               <w:right w:val="single" w:color="BBBBBB" w:sz="1"/>
             </w:tcBorders>
-            <w:shd w:fill="D9E2F3" w:val="clear"/>
+            <w:shd w:fill="EDEDED" w:val="clear"/>
             <w:tcMar>
               <w:top w:type="dxa" w:w="60"/>
               <w:left w:type="dxa" w:w="110"/>
@@ -1129,7 +1129,7 @@
               <w:bottom w:val="single" w:color="BBBBBB" w:sz="1"/>
               <w:right w:val="single" w:color="BBBBBB" w:sz="1"/>
             </w:tcBorders>
-            <w:shd w:fill="D9E2F3" w:val="clear"/>
+            <w:shd w:fill="EDEDED" w:val="clear"/>
             <w:tcMar>
               <w:top w:type="dxa" w:w="60"/>
               <w:left w:type="dxa" w:w="110"/>
@@ -3588,7 +3588,7 @@
     <w:rPrDefault>
       <w:rPr>
         <w:rFonts w:ascii="Arial" w:cs="Arial" w:eastAsia="Arial" w:hAnsi="Arial"/>
-        <w:color w:val="222222"/>
+        <w:color w:val="1A1A1A"/>
         <w:sz w:val="22"/>
         <w:szCs w:val="22"/>
       </w:rPr>
@@ -3611,7 +3611,7 @@
     <w:next w:val="Normal"/>
     <w:qFormat/>
     <w:rPr>
-      <w:color w:val="2E74B5"/>
+      <w:color w:val="000000"/>
       <w:sz w:val="32"/>
       <w:szCs w:val="32"/>
     </w:rPr>
@@ -3622,7 +3622,7 @@
     <w:next w:val="Normal"/>
     <w:qFormat/>
     <w:rPr>
-      <w:color w:val="2E74B5"/>
+      <w:color w:val="000000"/>
       <w:sz w:val="26"/>
       <w:szCs w:val="26"/>
     </w:rPr>
@@ -3633,7 +3633,7 @@
     <w:next w:val="Normal"/>
     <w:qFormat/>
     <w:rPr>
-      <w:color w:val="1F4D78"/>
+      <w:color w:val="000000"/>
       <w:sz w:val="24"/>
       <w:szCs w:val="24"/>
     </w:rPr>
@@ -3646,7 +3646,7 @@
     <w:rPr>
       <w:i/>
       <w:iCs/>
-      <w:color w:val="2E74B5"/>
+      <w:color w:val="000000"/>
     </w:rPr>
   </w:style>
   <w:style w:type="paragraph" w:styleId="Heading5">
@@ -3655,7 +3655,7 @@
     <w:next w:val="Normal"/>
     <w:qFormat/>
     <w:rPr>
-      <w:color w:val="2E74B5"/>
+      <w:color w:val="000000"/>
     </w:rPr>
   </w:style>
   <w:style w:type="paragraph" w:styleId="Heading6">
@@ -3664,7 +3664,7 @@
     <w:next w:val="Normal"/>
     <w:qFormat/>
     <w:rPr>
-      <w:color w:val="1F4D78"/>
+      <w:color w:val="000000"/>
     </w:rPr>
   </w:style>
   <w:style w:type="paragraph" w:styleId="Strong">
@@ -3688,7 +3688,7 @@
     <w:uiPriority w:val="99"/>
     <w:unhideWhenUsed/>
     <w:rPr>
-      <w:color w:val="0563C1"/>
+      <w:color w:val="000000"/>
       <w:u w:val="single"/>
     </w:rPr>
   </w:style>
@@ -3779,7 +3779,7 @@
       <w:rFonts w:ascii="Arial" w:cs="Arial" w:eastAsia="Arial" w:hAnsi="Arial"/>
       <w:b/>
       <w:bCs/>
-      <w:color w:val="1F3864"/>
+      <w:color w:val="000000"/>
       <w:sz w:val="30"/>
       <w:szCs w:val="30"/>
     </w:rPr>
@@ -3799,7 +3799,7 @@
       <w:bCs/>
       <w:i/>
       <w:iCs/>
-      <w:color w:val="2E74B5"/>
+      <w:color w:val="000000"/>
       <w:sz w:val="25"/>
       <w:szCs w:val="25"/>
     </w:rPr>
@@ -3817,7 +3817,7 @@
       <w:rFonts w:ascii="Arial" w:cs="Arial" w:eastAsia="Arial" w:hAnsi="Arial"/>
       <w:b/>
       <w:bCs/>
-      <w:color w:val="222222"/>
+      <w:color w:val="000000"/>
       <w:sz w:val="23"/>
       <w:szCs w:val="23"/>
     </w:rPr>
@@ -3837,7 +3837,7 @@
       <w:bCs/>
       <w:i/>
       <w:iCs/>
-      <w:color w:val="444444"/>
+      <w:color w:val="000000"/>
       <w:sz w:val="22"/>
       <w:szCs w:val="22"/>
     </w:rPr>

</xml_diff>

<commit_message>
docs: regenerate GDD for village, game-over buttons, and removed history
Co-Authored-By: Claude Opus 4.8 <noreply@anthropic.com>
</commit_message>
<xml_diff>
--- a/GDD_Tahan_Pedas_iGDD.docx
+++ b/GDD_Tahan_Pedas_iGDD.docx
@@ -1924,7 +1924,7 @@
         <w:jc w:val="both"/>
       </w:pPr>
       <w:r>
-        <w:t xml:space="preserve">Elemen di luar gameplay inti: bangunan pos ronda (dek kayu, tiang, atap, pagar bambu), meja rendah 3D dengan tikar lesehan tempat pemain duduk melingkar, lampu teplok gantung sebagai sumber cahaya, botol susu di atas meja milik pemain aktif, serta sistem kamera yang berpindah fokus ke wajah pemain yang sedang bermain.</w:t>
+        <w:t xml:space="preserve">Elemen di luar gameplay inti: bangunan pos ronda (dek kayu, tiang, atap, pagar bambu), meja rendah 3D dengan tikar lesehan tempat pemain duduk melingkar, lampu teplok gantung sebagai sumber cahaya, botol susu di atas meja milik pemain aktif, jalan kampung di depan pos (jalan tanah, rumah warga berjendela menyala, tiang listrik, kendaraan yang lewat, dan tukang nasi goreng dorong gerobak), serta sistem kamera yang berpindah fokus ke wajah pemain yang sedang bermain.</w:t>
       </w:r>
     </w:p>
     <w:p>
@@ -1942,7 +1942,7 @@
         <w:jc w:val="both"/>
       </w:pPr>
       <w:r>
-        <w:t xml:space="preserve">Elemen pencatat progres pemain: skor permanen, papan skor (Scoreboard) realtime, indikator ronde/giliran, statistik playtesting (cabai favorit, kepedasan tertinggi, penebak terbaik, paling sering Bust), gelar gaya bermain, serta penyimpanan state ke localStorage dan Riwayat Bermain.</w:t>
+        <w:t xml:space="preserve">Elemen pencatat progres pemain: skor permanen, papan skor (Scoreboard) realtime, indikator ronde/giliran, statistik playtesting (cabai favorit, kepedasan tertinggi, penebak terbaik, paling sering Bust), gelar gaya bermain, serta penyimpanan state permainan berjalan ke localStorage (auto-resume).</w:t>
       </w:r>
     </w:p>
     <w:p>
@@ -2020,7 +2020,7 @@
         <w:jc w:val="both"/>
       </w:pPr>
       <w:r>
-        <w:t xml:space="preserve">UI 2D (React + Tailwind): layar Intro, Menu, Setup, Draft, HUD bermain, Toko, Result, Game Over, Riwayat, Pengaturan, Tutorial.</w:t>
+        <w:t xml:space="preserve">UI 2D (React + Tailwind): layar Intro, Menu, Setup, Draft, HUD bermain, Toko, Result, Game Over, Pengaturan, Tutorial.</w:t>
       </w:r>
     </w:p>
     <w:p>
@@ -2380,7 +2380,7 @@
         <w:jc w:val="both"/>
       </w:pPr>
       <w:r>
-        <w:t xml:space="preserve">Layar yang dapat dimanipulasi pemain: Intro, Menu utama (Main Bareng, Cara Main, Riwayat, Pengaturan), Setup (jumlah &amp; nama pemain), Draft (pemilihan karakter), Layar Bermain (panggung 3D + HUD: meter kepedesan, poin ronde, tombol mangkok, Susu, Sajikan, Terawang, panel taruhan), Toko, Result, Game Over, Riwayat Bermain, dan Pengaturan.</w:t>
+        <w:t xml:space="preserve">Layar yang dapat dimanipulasi pemain: Intro (langsung Mulai Bermain, tanpa input nama), Menu utama (Main Bareng, Cara Main, Pengaturan), Setup (pilih jumlah pemain 2–4 &amp; ganti nama; default Pemain 1/2/3/4), Draft (pemilihan karakter), Layar Bermain (panggung 3D + HUD: meter kepedesan, poin ronde, tombol mangkok, Susu, Sajikan, Terawang, panel taruhan), Toko, Result, Game Over, dan Pengaturan (hanya suara). Game Over menampilkan papan skor akhir + statistik dengan dua tombol: Main Lagi (mengulang dengan nama &amp; jumlah pemain yang sama, skor &amp; karakter di-reset) dan Menu.</w:t>
       </w:r>
     </w:p>
     <w:p>
@@ -2542,7 +2542,7 @@
         <w:jc w:val="both"/>
       </w:pPr>
       <w:r>
-        <w:t xml:space="preserve">Panggung 3D malam: ambient gelap kebiruan + cahaya bulan redup, lampu teplok hangat sebagai key light di tengah gardu, kabut malam, dan latar siluet hutan dengan bulan &amp; bintang. Kamera melakukan transisi halus (lerp) ke wajah pemain aktif.</w:t>
+        <w:t xml:space="preserve">Panggung 3D malam: ambient gelap kebiruan + cahaya bulan redup, lampu teplok hangat sebagai key light di tengah gardu, kabut malam, dan latar siluet hutan dengan bulan &amp; bintang. Di depan pos terbentang jalan kampung malam (rumah berjendela menyala, tiang listrik, kendaraan &amp; tukang nasi goreng yang bergerak) sebagai latar yang hidup. Kamera melakukan transisi halus (lerp) ke wajah pemain aktif dan dapat di-zoom keluar untuk melihat jalan kampung.</w:t>
       </w:r>
     </w:p>
     <w:p>
@@ -3302,7 +3302,7 @@
         <w:jc w:val="both"/>
       </w:pPr>
       <w:r>
-        <w:t xml:space="preserve">Hasil &amp; data playtesting (mis. ekspor CSV simulasi, Riwayat Bermain).</w:t>
+        <w:t xml:space="preserve">Hasil &amp; data playtesting (mis. ekspor CSV simulasi).</w:t>
       </w:r>
     </w:p>
     <w:p>

</xml_diff>

<commit_message>
feat: remove playtesting statistics from the Game Over screen
Drop the "Statistik Playtesting" card (favourite chili, spiciest, best guesser,
most busted) and the per-player playstyle title, leaving a clean podium:
winner, ranking with score/character, and the Main Lagi / Menu buttons. GDD
updated to match.

Co-Authored-By: Claude Opus 4.8 <noreply@anthropic.com>
</commit_message>
<xml_diff>
--- a/GDD_Tahan_Pedas_iGDD.docx
+++ b/GDD_Tahan_Pedas_iGDD.docx
@@ -1942,7 +1942,7 @@
         <w:jc w:val="both"/>
       </w:pPr>
       <w:r>
-        <w:t xml:space="preserve">Elemen pencatat progres pemain: skor permanen, papan skor (Scoreboard) realtime, indikator ronde/giliran, statistik playtesting (cabai favorit, kepedasan tertinggi, penebak terbaik, paling sering Bust), gelar gaya bermain, serta penyimpanan state permainan berjalan ke localStorage (auto-resume).</w:t>
+        <w:t xml:space="preserve">Elemen pencatat progres pemain: skor permanen, papan skor (Scoreboard) realtime, indikator ronde/giliran, papan skor akhir (klasemen) di layar Game Over, serta penyimpanan state permainan berjalan ke localStorage (auto-resume).</w:t>
       </w:r>
     </w:p>
     <w:p>
@@ -2173,7 +2173,7 @@
         <w:jc w:val="both"/>
       </w:pPr>
       <w:r>
-        <w:t xml:space="preserve">Tujuan pelengkap yang tidak wajib: menebak taruhan dengan benar untuk poin tambahan, menguasai karakter pilihan, dan meraih gelar gaya bermain (mis. Carolina Lover, Pengamat Ulung).</w:t>
+        <w:t xml:space="preserve">Tujuan pelengkap yang tidak wajib: menebak taruhan dengan benar untuk poin tambahan dan menguasai karakter pilihan untuk memaksimalkan strategi.</w:t>
       </w:r>
     </w:p>
     <w:p>
@@ -2200,7 +2200,7 @@
         <w:jc w:val="both"/>
       </w:pPr>
       <w:r>
-        <w:t xml:space="preserve">Imbalan yang berkaitan dengan pengalaman, bukan kemampuan: gelar gaya bermain di akhir game, status “juara”, bahan candaan sosial, serta statistik playtesting yang ditampilkan.</w:t>
+        <w:t xml:space="preserve">Imbalan yang berkaitan dengan pengalaman, bukan kemampuan: status “juara” di akhir game, hak membanggakan diri (bragging rights), dan bahan candaan sosial.</w:t>
       </w:r>
     </w:p>
     <w:p>
@@ -2380,7 +2380,7 @@
         <w:jc w:val="both"/>
       </w:pPr>
       <w:r>
-        <w:t xml:space="preserve">Layar yang dapat dimanipulasi pemain: Intro (langsung Mulai Bermain, tanpa input nama), Menu utama (Main Bareng, Cara Main, Pengaturan), Setup (pilih jumlah pemain 2–4 &amp; ganti nama; default Pemain 1/2/3/4), Draft (pemilihan karakter), Layar Bermain (panggung 3D + HUD: meter kepedesan, poin ronde, tombol mangkok, Susu, Sajikan, Terawang, panel taruhan), Toko, Result, Game Over, dan Pengaturan (hanya suara). Game Over menampilkan papan skor akhir + statistik dengan dua tombol: Main Lagi (mengulang dengan nama &amp; jumlah pemain yang sama, skor &amp; karakter di-reset) dan Menu.</w:t>
+        <w:t xml:space="preserve">Layar yang dapat dimanipulasi pemain: Intro (langsung Mulai Bermain, tanpa input nama), Menu utama (Main Bareng, Cara Main, Pengaturan), Setup (pilih jumlah pemain 2–4 &amp; ganti nama; default Pemain 1/2/3/4), Draft (pemilihan karakter), Layar Bermain (panggung 3D + HUD: meter kepedesan, poin ronde, tombol mangkok, Susu, Sajikan, Terawang, panel taruhan), Toko, Result, Game Over, dan Pengaturan (hanya suara). Game Over menampilkan papan skor akhir (klasemen) dengan dua tombol: Main Lagi (mengulang dengan nama &amp; jumlah pemain yang sama, skor &amp; karakter di-reset) dan Menu.</w:t>
       </w:r>
     </w:p>
     <w:p>

</xml_diff>

<commit_message>
docs: correct audio assets (royalty-free music) + add 8-point UCP mapping
The background music isn't synth: it's two royalty-free tracks (lobby
"massobeats - ruby" from freetouse.com, in-game from NCS/NoCopyrightSounds),
so fix the Assets list and add attribution in Document references. Also add a
mapping table up front showing where each of the 8 mandatory UCP-4 points
lives in the iGDD structure.

Co-Authored-By: Claude Opus 4.8 <noreply@anthropic.com>
</commit_message>
<xml_diff>
--- a/GDD_Tahan_Pedas_iGDD.docx
+++ b/GDD_Tahan_Pedas_iGDD.docx
@@ -148,6 +148,615 @@
         </w:p>
       </w:sdtContent>
     </w:sdt>
+    <w:p>
+      <w:r>
+        <w:br w:type="page"/>
+      </w:r>
+    </w:p>
+    <w:p>
+      <w:pPr>
+        <w:pStyle w:val="Heading1"/>
+        <w:spacing w:after="140" w:before="240"/>
+      </w:pPr>
+      <w:r>
+        <w:t xml:space="preserve">Pemetaan 8 Poin Wajib UCP 4</w:t>
+      </w:r>
+    </w:p>
+    <w:p>
+      <w:pPr>
+        <w:spacing w:after="120" w:line="276"/>
+        <w:jc w:val="both"/>
+      </w:pPr>
+      <w:r>
+        <w:t xml:space="preserve">Dokumen ini memakai struktur template iGDD, namun seluruh 8 poin wajib UCP 4 tetap tercakup. Tabel berikut menunjukkan letak masing-masing poin di dalam dokumen:</w:t>
+      </w:r>
+    </w:p>
+    <w:tbl>
+      <w:tblPr>
+        <w:tblW w:type="dxa" w:w="9360"/>
+        <w:tblBorders>
+          <w:top w:val="single" w:color="auto" w:sz="4"/>
+          <w:left w:val="single" w:color="auto" w:sz="4"/>
+          <w:bottom w:val="single" w:color="auto" w:sz="4"/>
+          <w:right w:val="single" w:color="auto" w:sz="4"/>
+          <w:insideH w:val="single" w:color="auto" w:sz="4"/>
+          <w:insideV w:val="single" w:color="auto" w:sz="4"/>
+        </w:tblBorders>
+      </w:tblPr>
+      <w:tblGrid>
+        <w:gridCol w:w="3400"/>
+        <w:gridCol w:w="5960"/>
+      </w:tblGrid>
+      <w:tr>
+        <w:trPr>
+          <w:tblHeader/>
+        </w:trPr>
+        <w:tc>
+          <w:tcPr>
+            <w:tcW w:type="dxa" w:w="3400"/>
+            <w:tcBorders>
+              <w:top w:val="single" w:color="BBBBBB" w:sz="1"/>
+              <w:left w:val="single" w:color="BBBBBB" w:sz="1"/>
+              <w:bottom w:val="single" w:color="BBBBBB" w:sz="1"/>
+              <w:right w:val="single" w:color="BBBBBB" w:sz="1"/>
+            </w:tcBorders>
+            <w:shd w:fill="EDEDED" w:val="clear"/>
+            <w:tcMar>
+              <w:top w:type="dxa" w:w="60"/>
+              <w:left w:type="dxa" w:w="110"/>
+              <w:bottom w:type="dxa" w:w="60"/>
+              <w:right w:type="dxa" w:w="110"/>
+            </w:tcMar>
+          </w:tcPr>
+          <w:p>
+            <w:pPr>
+              <w:spacing w:after="0" w:line="252"/>
+            </w:pPr>
+            <w:r>
+              <w:rPr>
+                <w:b/>
+                <w:bCs/>
+              </w:rPr>
+              <w:t xml:space="preserve">Poin Wajib UCP 4</w:t>
+            </w:r>
+          </w:p>
+        </w:tc>
+        <w:tc>
+          <w:tcPr>
+            <w:tcW w:type="dxa" w:w="5960"/>
+            <w:tcBorders>
+              <w:top w:val="single" w:color="BBBBBB" w:sz="1"/>
+              <w:left w:val="single" w:color="BBBBBB" w:sz="1"/>
+              <w:bottom w:val="single" w:color="BBBBBB" w:sz="1"/>
+              <w:right w:val="single" w:color="BBBBBB" w:sz="1"/>
+            </w:tcBorders>
+            <w:shd w:fill="EDEDED" w:val="clear"/>
+            <w:tcMar>
+              <w:top w:type="dxa" w:w="60"/>
+              <w:left w:type="dxa" w:w="110"/>
+              <w:bottom w:type="dxa" w:w="60"/>
+              <w:right w:type="dxa" w:w="110"/>
+            </w:tcMar>
+          </w:tcPr>
+          <w:p>
+            <w:pPr>
+              <w:spacing w:after="0" w:line="252"/>
+            </w:pPr>
+            <w:r>
+              <w:rPr>
+                <w:b/>
+                <w:bCs/>
+              </w:rPr>
+              <w:t xml:space="preserve">Lokasi di dokumen ini</w:t>
+            </w:r>
+          </w:p>
+        </w:tc>
+      </w:tr>
+      <w:tr>
+        <w:trPr>
+          <w:tblHeader w:val="false"/>
+        </w:trPr>
+        <w:tc>
+          <w:tcPr>
+            <w:tcW w:type="dxa" w:w="3400"/>
+            <w:tcBorders>
+              <w:top w:val="single" w:color="BBBBBB" w:sz="1"/>
+              <w:left w:val="single" w:color="BBBBBB" w:sz="1"/>
+              <w:bottom w:val="single" w:color="BBBBBB" w:sz="1"/>
+              <w:right w:val="single" w:color="BBBBBB" w:sz="1"/>
+            </w:tcBorders>
+            <w:tcMar>
+              <w:top w:type="dxa" w:w="60"/>
+              <w:left w:type="dxa" w:w="110"/>
+              <w:bottom w:type="dxa" w:w="60"/>
+              <w:right w:type="dxa" w:w="110"/>
+            </w:tcMar>
+          </w:tcPr>
+          <w:p>
+            <w:pPr>
+              <w:spacing w:after="0" w:line="252"/>
+            </w:pPr>
+            <w:r>
+              <w:rPr>
+                <w:b w:val="false"/>
+                <w:bCs w:val="false"/>
+              </w:rPr>
+              <w:t xml:space="preserve">1. Abstract / Rangkuman</w:t>
+            </w:r>
+          </w:p>
+        </w:tc>
+        <w:tc>
+          <w:tcPr>
+            <w:tcW w:type="dxa" w:w="5960"/>
+            <w:tcBorders>
+              <w:top w:val="single" w:color="BBBBBB" w:sz="1"/>
+              <w:left w:val="single" w:color="BBBBBB" w:sz="1"/>
+              <w:bottom w:val="single" w:color="BBBBBB" w:sz="1"/>
+              <w:right w:val="single" w:color="BBBBBB" w:sz="1"/>
+            </w:tcBorders>
+            <w:tcMar>
+              <w:top w:type="dxa" w:w="60"/>
+              <w:left w:type="dxa" w:w="110"/>
+              <w:bottom w:type="dxa" w:w="60"/>
+              <w:right w:type="dxa" w:w="110"/>
+            </w:tcMar>
+          </w:tcPr>
+          <w:p>
+            <w:pPr>
+              <w:spacing w:after="0" w:line="252"/>
+            </w:pPr>
+            <w:r>
+              <w:rPr>
+                <w:b w:val="false"/>
+                <w:bCs w:val="false"/>
+              </w:rPr>
+              <w:t xml:space="preserve">1.1 Game abstract</w:t>
+            </w:r>
+          </w:p>
+        </w:tc>
+      </w:tr>
+      <w:tr>
+        <w:trPr>
+          <w:tblHeader w:val="false"/>
+        </w:trPr>
+        <w:tc>
+          <w:tcPr>
+            <w:tcW w:type="dxa" w:w="3400"/>
+            <w:tcBorders>
+              <w:top w:val="single" w:color="BBBBBB" w:sz="1"/>
+              <w:left w:val="single" w:color="BBBBBB" w:sz="1"/>
+              <w:bottom w:val="single" w:color="BBBBBB" w:sz="1"/>
+              <w:right w:val="single" w:color="BBBBBB" w:sz="1"/>
+            </w:tcBorders>
+            <w:tcMar>
+              <w:top w:type="dxa" w:w="60"/>
+              <w:left w:type="dxa" w:w="110"/>
+              <w:bottom w:type="dxa" w:w="60"/>
+              <w:right w:type="dxa" w:w="110"/>
+            </w:tcMar>
+          </w:tcPr>
+          <w:p>
+            <w:pPr>
+              <w:spacing w:after="0" w:line="252"/>
+            </w:pPr>
+            <w:r>
+              <w:rPr>
+                <w:b w:val="false"/>
+                <w:bCs w:val="false"/>
+              </w:rPr>
+              <w:t xml:space="preserve">2. Player</w:t>
+            </w:r>
+          </w:p>
+        </w:tc>
+        <w:tc>
+          <w:tcPr>
+            <w:tcW w:type="dxa" w:w="5960"/>
+            <w:tcBorders>
+              <w:top w:val="single" w:color="BBBBBB" w:sz="1"/>
+              <w:left w:val="single" w:color="BBBBBB" w:sz="1"/>
+              <w:bottom w:val="single" w:color="BBBBBB" w:sz="1"/>
+              <w:right w:val="single" w:color="BBBBBB" w:sz="1"/>
+            </w:tcBorders>
+            <w:tcMar>
+              <w:top w:type="dxa" w:w="60"/>
+              <w:left w:type="dxa" w:w="110"/>
+              <w:bottom w:type="dxa" w:w="60"/>
+              <w:right w:type="dxa" w:w="110"/>
+            </w:tcMar>
+          </w:tcPr>
+          <w:p>
+            <w:pPr>
+              <w:spacing w:after="0" w:line="252"/>
+            </w:pPr>
+            <w:r>
+              <w:rPr>
+                <w:b w:val="false"/>
+                <w:bCs w:val="false"/>
+              </w:rPr>
+              <w:t xml:space="preserve">1.5.2 Number of players &amp; 1.6 Player characteristics</w:t>
+            </w:r>
+          </w:p>
+        </w:tc>
+      </w:tr>
+      <w:tr>
+        <w:trPr>
+          <w:tblHeader w:val="false"/>
+        </w:trPr>
+        <w:tc>
+          <w:tcPr>
+            <w:tcW w:type="dxa" w:w="3400"/>
+            <w:tcBorders>
+              <w:top w:val="single" w:color="BBBBBB" w:sz="1"/>
+              <w:left w:val="single" w:color="BBBBBB" w:sz="1"/>
+              <w:bottom w:val="single" w:color="BBBBBB" w:sz="1"/>
+              <w:right w:val="single" w:color="BBBBBB" w:sz="1"/>
+            </w:tcBorders>
+            <w:tcMar>
+              <w:top w:type="dxa" w:w="60"/>
+              <w:left w:type="dxa" w:w="110"/>
+              <w:bottom w:type="dxa" w:w="60"/>
+              <w:right w:type="dxa" w:w="110"/>
+            </w:tcMar>
+          </w:tcPr>
+          <w:p>
+            <w:pPr>
+              <w:spacing w:after="0" w:line="252"/>
+            </w:pPr>
+            <w:r>
+              <w:rPr>
+                <w:b w:val="false"/>
+                <w:bCs w:val="false"/>
+              </w:rPr>
+              <w:t xml:space="preserve">3. Goal</w:t>
+            </w:r>
+          </w:p>
+        </w:tc>
+        <w:tc>
+          <w:tcPr>
+            <w:tcW w:type="dxa" w:w="5960"/>
+            <w:tcBorders>
+              <w:top w:val="single" w:color="BBBBBB" w:sz="1"/>
+              <w:left w:val="single" w:color="BBBBBB" w:sz="1"/>
+              <w:bottom w:val="single" w:color="BBBBBB" w:sz="1"/>
+              <w:right w:val="single" w:color="BBBBBB" w:sz="1"/>
+            </w:tcBorders>
+            <w:tcMar>
+              <w:top w:type="dxa" w:w="60"/>
+              <w:left w:type="dxa" w:w="110"/>
+              <w:bottom w:type="dxa" w:w="60"/>
+              <w:right w:type="dxa" w:w="110"/>
+            </w:tcMar>
+          </w:tcPr>
+          <w:p>
+            <w:pPr>
+              <w:spacing w:after="0" w:line="252"/>
+            </w:pPr>
+            <w:r>
+              <w:rPr>
+                <w:b w:val="false"/>
+                <w:bCs w:val="false"/>
+              </w:rPr>
+              <w:t xml:space="preserve">1.3 Game justification &amp; 3.2.1 Objectives (Primary &amp; Secondary)</w:t>
+            </w:r>
+          </w:p>
+        </w:tc>
+      </w:tr>
+      <w:tr>
+        <w:trPr>
+          <w:tblHeader w:val="false"/>
+        </w:trPr>
+        <w:tc>
+          <w:tcPr>
+            <w:tcW w:type="dxa" w:w="3400"/>
+            <w:tcBorders>
+              <w:top w:val="single" w:color="BBBBBB" w:sz="1"/>
+              <w:left w:val="single" w:color="BBBBBB" w:sz="1"/>
+              <w:bottom w:val="single" w:color="BBBBBB" w:sz="1"/>
+              <w:right w:val="single" w:color="BBBBBB" w:sz="1"/>
+            </w:tcBorders>
+            <w:tcMar>
+              <w:top w:type="dxa" w:w="60"/>
+              <w:left w:type="dxa" w:w="110"/>
+              <w:bottom w:type="dxa" w:w="60"/>
+              <w:right w:type="dxa" w:w="110"/>
+            </w:tcMar>
+          </w:tcPr>
+          <w:p>
+            <w:pPr>
+              <w:spacing w:after="0" w:line="252"/>
+            </w:pPr>
+            <w:r>
+              <w:rPr>
+                <w:b w:val="false"/>
+                <w:bCs w:val="false"/>
+              </w:rPr>
+              <w:t xml:space="preserve">4. Challenge</w:t>
+            </w:r>
+          </w:p>
+        </w:tc>
+        <w:tc>
+          <w:tcPr>
+            <w:tcW w:type="dxa" w:w="5960"/>
+            <w:tcBorders>
+              <w:top w:val="single" w:color="BBBBBB" w:sz="1"/>
+              <w:left w:val="single" w:color="BBBBBB" w:sz="1"/>
+              <w:bottom w:val="single" w:color="BBBBBB" w:sz="1"/>
+              <w:right w:val="single" w:color="BBBBBB" w:sz="1"/>
+            </w:tcBorders>
+            <w:tcMar>
+              <w:top w:type="dxa" w:w="60"/>
+              <w:left w:type="dxa" w:w="110"/>
+              <w:bottom w:type="dxa" w:w="60"/>
+              <w:right w:type="dxa" w:w="110"/>
+            </w:tcMar>
+          </w:tcPr>
+          <w:p>
+            <w:pPr>
+              <w:spacing w:after="0" w:line="252"/>
+            </w:pPr>
+            <w:r>
+              <w:rPr>
+                <w:b w:val="false"/>
+                <w:bCs w:val="false"/>
+              </w:rPr>
+              <w:t xml:space="preserve">3.2.3 Challenges</w:t>
+            </w:r>
+          </w:p>
+        </w:tc>
+      </w:tr>
+      <w:tr>
+        <w:trPr>
+          <w:tblHeader w:val="false"/>
+        </w:trPr>
+        <w:tc>
+          <w:tcPr>
+            <w:tcW w:type="dxa" w:w="3400"/>
+            <w:tcBorders>
+              <w:top w:val="single" w:color="BBBBBB" w:sz="1"/>
+              <w:left w:val="single" w:color="BBBBBB" w:sz="1"/>
+              <w:bottom w:val="single" w:color="BBBBBB" w:sz="1"/>
+              <w:right w:val="single" w:color="BBBBBB" w:sz="1"/>
+            </w:tcBorders>
+            <w:tcMar>
+              <w:top w:type="dxa" w:w="60"/>
+              <w:left w:type="dxa" w:w="110"/>
+              <w:bottom w:type="dxa" w:w="60"/>
+              <w:right w:type="dxa" w:w="110"/>
+            </w:tcMar>
+          </w:tcPr>
+          <w:p>
+            <w:pPr>
+              <w:spacing w:after="0" w:line="252"/>
+            </w:pPr>
+            <w:r>
+              <w:rPr>
+                <w:b w:val="false"/>
+                <w:bCs w:val="false"/>
+              </w:rPr>
+              <w:t xml:space="preserve">5. Rules</w:t>
+            </w:r>
+          </w:p>
+        </w:tc>
+        <w:tc>
+          <w:tcPr>
+            <w:tcW w:type="dxa" w:w="5960"/>
+            <w:tcBorders>
+              <w:top w:val="single" w:color="BBBBBB" w:sz="1"/>
+              <w:left w:val="single" w:color="BBBBBB" w:sz="1"/>
+              <w:bottom w:val="single" w:color="BBBBBB" w:sz="1"/>
+              <w:right w:val="single" w:color="BBBBBB" w:sz="1"/>
+            </w:tcBorders>
+            <w:tcMar>
+              <w:top w:type="dxa" w:w="60"/>
+              <w:left w:type="dxa" w:w="110"/>
+              <w:bottom w:type="dxa" w:w="60"/>
+              <w:right w:type="dxa" w:w="110"/>
+            </w:tcMar>
+          </w:tcPr>
+          <w:p>
+            <w:pPr>
+              <w:spacing w:after="0" w:line="252"/>
+            </w:pPr>
+            <w:r>
+              <w:rPr>
+                <w:b w:val="false"/>
+                <w:bCs w:val="false"/>
+              </w:rPr>
+              <w:t xml:space="preserve">2.3 Rules &amp; 2.3.1 Interaction rules</w:t>
+            </w:r>
+          </w:p>
+        </w:tc>
+      </w:tr>
+      <w:tr>
+        <w:trPr>
+          <w:tblHeader w:val="false"/>
+        </w:trPr>
+        <w:tc>
+          <w:tcPr>
+            <w:tcW w:type="dxa" w:w="3400"/>
+            <w:tcBorders>
+              <w:top w:val="single" w:color="BBBBBB" w:sz="1"/>
+              <w:left w:val="single" w:color="BBBBBB" w:sz="1"/>
+              <w:bottom w:val="single" w:color="BBBBBB" w:sz="1"/>
+              <w:right w:val="single" w:color="BBBBBB" w:sz="1"/>
+            </w:tcBorders>
+            <w:tcMar>
+              <w:top w:type="dxa" w:w="60"/>
+              <w:left w:type="dxa" w:w="110"/>
+              <w:bottom w:type="dxa" w:w="60"/>
+              <w:right w:type="dxa" w:w="110"/>
+            </w:tcMar>
+          </w:tcPr>
+          <w:p>
+            <w:pPr>
+              <w:spacing w:after="0" w:line="252"/>
+            </w:pPr>
+            <w:r>
+              <w:rPr>
+                <w:b w:val="false"/>
+                <w:bCs w:val="false"/>
+              </w:rPr>
+              <w:t xml:space="preserve">6. Mechanic</w:t>
+            </w:r>
+          </w:p>
+        </w:tc>
+        <w:tc>
+          <w:tcPr>
+            <w:tcW w:type="dxa" w:w="5960"/>
+            <w:tcBorders>
+              <w:top w:val="single" w:color="BBBBBB" w:sz="1"/>
+              <w:left w:val="single" w:color="BBBBBB" w:sz="1"/>
+              <w:bottom w:val="single" w:color="BBBBBB" w:sz="1"/>
+              <w:right w:val="single" w:color="BBBBBB" w:sz="1"/>
+            </w:tcBorders>
+            <w:tcMar>
+              <w:top w:type="dxa" w:w="60"/>
+              <w:left w:type="dxa" w:w="110"/>
+              <w:bottom w:type="dxa" w:w="60"/>
+              <w:right w:type="dxa" w:w="110"/>
+            </w:tcMar>
+          </w:tcPr>
+          <w:p>
+            <w:pPr>
+              <w:spacing w:after="0" w:line="252"/>
+            </w:pPr>
+            <w:r>
+              <w:rPr>
+                <w:b w:val="false"/>
+                <w:bCs w:val="false"/>
+              </w:rPr>
+              <w:t xml:space="preserve">Bab 2 — Mechanics (2.1–2.7)</w:t>
+            </w:r>
+          </w:p>
+        </w:tc>
+      </w:tr>
+      <w:tr>
+        <w:trPr>
+          <w:tblHeader w:val="false"/>
+        </w:trPr>
+        <w:tc>
+          <w:tcPr>
+            <w:tcW w:type="dxa" w:w="3400"/>
+            <w:tcBorders>
+              <w:top w:val="single" w:color="BBBBBB" w:sz="1"/>
+              <w:left w:val="single" w:color="BBBBBB" w:sz="1"/>
+              <w:bottom w:val="single" w:color="BBBBBB" w:sz="1"/>
+              <w:right w:val="single" w:color="BBBBBB" w:sz="1"/>
+            </w:tcBorders>
+            <w:tcMar>
+              <w:top w:type="dxa" w:w="60"/>
+              <w:left w:type="dxa" w:w="110"/>
+              <w:bottom w:type="dxa" w:w="60"/>
+              <w:right w:type="dxa" w:w="110"/>
+            </w:tcMar>
+          </w:tcPr>
+          <w:p>
+            <w:pPr>
+              <w:spacing w:after="0" w:line="252"/>
+            </w:pPr>
+            <w:r>
+              <w:rPr>
+                <w:b w:val="false"/>
+                <w:bCs w:val="false"/>
+              </w:rPr>
+              <w:t xml:space="preserve">7. Space</w:t>
+            </w:r>
+          </w:p>
+        </w:tc>
+        <w:tc>
+          <w:tcPr>
+            <w:tcW w:type="dxa" w:w="5960"/>
+            <w:tcBorders>
+              <w:top w:val="single" w:color="BBBBBB" w:sz="1"/>
+              <w:left w:val="single" w:color="BBBBBB" w:sz="1"/>
+              <w:bottom w:val="single" w:color="BBBBBB" w:sz="1"/>
+              <w:right w:val="single" w:color="BBBBBB" w:sz="1"/>
+            </w:tcBorders>
+            <w:tcMar>
+              <w:top w:type="dxa" w:w="60"/>
+              <w:left w:type="dxa" w:w="110"/>
+              <w:bottom w:type="dxa" w:w="60"/>
+              <w:right w:type="dxa" w:w="110"/>
+            </w:tcMar>
+          </w:tcPr>
+          <w:p>
+            <w:pPr>
+              <w:spacing w:after="0" w:line="252"/>
+            </w:pPr>
+            <w:r>
+              <w:rPr>
+                <w:b w:val="false"/>
+                <w:bCs w:val="false"/>
+              </w:rPr>
+              <w:t xml:space="preserve">3.1 Game World, 3.4 Special areas, 3.5 Game interface</w:t>
+            </w:r>
+          </w:p>
+        </w:tc>
+      </w:tr>
+      <w:tr>
+        <w:trPr>
+          <w:tblHeader w:val="false"/>
+        </w:trPr>
+        <w:tc>
+          <w:tcPr>
+            <w:tcW w:type="dxa" w:w="3400"/>
+            <w:tcBorders>
+              <w:top w:val="single" w:color="BBBBBB" w:sz="1"/>
+              <w:left w:val="single" w:color="BBBBBB" w:sz="1"/>
+              <w:bottom w:val="single" w:color="BBBBBB" w:sz="1"/>
+              <w:right w:val="single" w:color="BBBBBB" w:sz="1"/>
+            </w:tcBorders>
+            <w:tcMar>
+              <w:top w:type="dxa" w:w="60"/>
+              <w:left w:type="dxa" w:w="110"/>
+              <w:bottom w:type="dxa" w:w="60"/>
+              <w:right w:type="dxa" w:w="110"/>
+            </w:tcMar>
+          </w:tcPr>
+          <w:p>
+            <w:pPr>
+              <w:spacing w:after="0" w:line="252"/>
+            </w:pPr>
+            <w:r>
+              <w:rPr>
+                <w:b w:val="false"/>
+                <w:bCs w:val="false"/>
+              </w:rPr>
+              <w:t xml:space="preserve">8. Component</w:t>
+            </w:r>
+          </w:p>
+        </w:tc>
+        <w:tc>
+          <w:tcPr>
+            <w:tcW w:type="dxa" w:w="5960"/>
+            <w:tcBorders>
+              <w:top w:val="single" w:color="BBBBBB" w:sz="1"/>
+              <w:left w:val="single" w:color="BBBBBB" w:sz="1"/>
+              <w:bottom w:val="single" w:color="BBBBBB" w:sz="1"/>
+              <w:right w:val="single" w:color="BBBBBB" w:sz="1"/>
+            </w:tcBorders>
+            <w:tcMar>
+              <w:top w:type="dxa" w:w="60"/>
+              <w:left w:type="dxa" w:w="110"/>
+              <w:bottom w:type="dxa" w:w="60"/>
+              <w:right w:type="dxa" w:w="110"/>
+            </w:tcMar>
+          </w:tcPr>
+          <w:p>
+            <w:pPr>
+              <w:spacing w:after="0" w:line="252"/>
+            </w:pPr>
+            <w:r>
+              <w:rPr>
+                <w:b w:val="false"/>
+                <w:bCs w:val="false"/>
+              </w:rPr>
+              <w:t xml:space="preserve">2.2 Core game elements &amp; 2.7 Assets list</w:t>
+            </w:r>
+          </w:p>
+        </w:tc>
+      </w:tr>
+    </w:tbl>
     <w:p>
       <w:r>
         <w:br w:type="page"/>
@@ -2006,7 +2615,7 @@
         <w:jc w:val="both"/>
       </w:pPr>
       <w:r>
-        <w:t xml:space="preserve">Suara: synth sound engine (Web Audio) untuk SFX makan, minum, tersedak, klik, dan musik latar — tanpa file audio aset.</w:t>
+        <w:t xml:space="preserve">Efek suara (SFX makan, minum, tersedak, klik): dibangkitkan sendiri lewat synth sound engine (Web Audio), tanpa file audio.</w:t>
       </w:r>
     </w:p>
     <w:p>
@@ -2020,6 +2629,20 @@
         <w:jc w:val="both"/>
       </w:pPr>
       <w:r>
+        <w:t xml:space="preserve">Musik latar: 2 file lagu royalty-free / no-copyright — musik menu &amp; lobby “massobeats — ruby” dari freetouse.com, serta musik dalam permainan dari NCS (NoCopyrightSounds, YouTube). Atribusi dicantumkan pada Bab 7.2.</w:t>
+      </w:r>
+    </w:p>
+    <w:p>
+      <w:pPr>
+        <w:pStyle w:val="ListParagraph"/>
+        <w:numPr>
+          <w:ilvl w:val="0"/>
+          <w:numId w:val="2"/>
+        </w:numPr>
+        <w:spacing w:after="60"/>
+        <w:jc w:val="both"/>
+      </w:pPr>
+      <w:r>
         <w:t xml:space="preserve">UI 2D (React + Tailwind): layar Intro, Menu, Setup, Draft, HUD bermain, Toko, Result, Game Over, Pengaturan, Tutorial.</w:t>
       </w:r>
     </w:p>
@@ -3257,6 +3880,27 @@
       </w:r>
       <w:r>
         <w:t xml:space="preserve">Panduan UCP 3 (Game Design) &amp; UCP 4 (GDD).</w:t>
+      </w:r>
+    </w:p>
+    <w:p>
+      <w:pPr>
+        <w:pStyle w:val="ListParagraph"/>
+        <w:numPr>
+          <w:ilvl w:val="0"/>
+          <w:numId w:val="2"/>
+        </w:numPr>
+        <w:spacing w:after="60"/>
+        <w:jc w:val="both"/>
+      </w:pPr>
+      <w:r>
+        <w:rPr>
+          <w:b/>
+          <w:bCs/>
+        </w:rPr>
+        <w:t xml:space="preserve">Musik (royalty-free / no-copyright): </w:t>
+      </w:r>
+      <w:r>
+        <w:t xml:space="preserve">Menu &amp; lobby — “massobeats — ruby” (freetouse.com). Dalam permainan — trek dari NCS / NoCopyrightSounds (YouTube). Digunakan sesuai lisensi bebas royalti.</w:t>
       </w:r>
     </w:p>
     <w:p>

</xml_diff>